<commit_message>
Implementação do avanço no relatório
</commit_message>
<xml_diff>
--- a/docs/Relatório de Usinagem CNC.docx
+++ b/docs/Relatório de Usinagem CNC.docx
@@ -101,13 +101,6 @@
         </w:rPr>
         <w:t>Nome: NOME</w:t>
       </w:r>
-      <w:r>
-        <w:rPr>
-          <w:sz w:val="22"/>
-          <w:szCs w:val="22"/>
-        </w:rPr>
-        <w:t>.</w:t>
-      </w:r>
     </w:p>
     <w:p>
       <w:pPr>
@@ -131,13 +124,6 @@
         </w:rPr>
         <w:t>Empresa: EMPRESA</w:t>
       </w:r>
-      <w:r>
-        <w:rPr>
-          <w:sz w:val="22"/>
-          <w:szCs w:val="22"/>
-        </w:rPr>
-        <w:t>.</w:t>
-      </w:r>
     </w:p>
     <w:p>
       <w:pPr>
@@ -161,13 +147,6 @@
         </w:rPr>
         <w:t>Modelo de máquina utilizada: MAQUINA</w:t>
       </w:r>
-      <w:r>
-        <w:rPr>
-          <w:sz w:val="22"/>
-          <w:szCs w:val="22"/>
-        </w:rPr>
-        <w:t>.</w:t>
-      </w:r>
     </w:p>
     <w:p>
       <w:pPr>
@@ -192,13 +171,6 @@
         </w:rPr>
         <w:t>N de Ordem: ORDEM</w:t>
       </w:r>
-      <w:r>
-        <w:rPr>
-          <w:sz w:val="22"/>
-          <w:szCs w:val="22"/>
-        </w:rPr>
-        <w:t>.</w:t>
-      </w:r>
     </w:p>
     <w:p>
       <w:pPr>
@@ -209,8 +181,6 @@
       <w:r>
         <w:t xml:space="preserve">               </w:t>
       </w:r>
-      <w:bookmarkStart w:id="0" w:name="_GoBack"/>
-      <w:bookmarkEnd w:id="0"/>
     </w:p>
     <w:p>
       <w:pPr>
@@ -260,13 +230,6 @@
         </w:rPr>
         <w:t>Material da peça: MATERIAL</w:t>
       </w:r>
-      <w:r>
-        <w:rPr>
-          <w:sz w:val="22"/>
-          <w:szCs w:val="22"/>
-        </w:rPr>
-        <w:t>.</w:t>
-      </w:r>
     </w:p>
     <w:p>
       <w:pPr>
@@ -290,13 +253,6 @@
         </w:rPr>
         <w:t>Ferramenta utilizada: FERRAMENTA</w:t>
       </w:r>
-      <w:r>
-        <w:rPr>
-          <w:sz w:val="22"/>
-          <w:szCs w:val="22"/>
-        </w:rPr>
-        <w:t>.</w:t>
-      </w:r>
     </w:p>
     <w:p>
       <w:pPr>
@@ -304,36 +260,7 @@
         <w:rPr>
           <w:sz w:val="22"/>
           <w:szCs w:val="22"/>
-        </w:rPr>
-      </w:pPr>
-      <w:r>
-        <w:rPr>
-          <w:sz w:val="22"/>
-          <w:szCs w:val="22"/>
-        </w:rPr>
-        <w:t xml:space="preserve">- </w:t>
-      </w:r>
-      <w:r>
-        <w:rPr>
-          <w:sz w:val="22"/>
-          <w:szCs w:val="22"/>
-        </w:rPr>
-        <w:t xml:space="preserve">RPM do spindle (rotação da máquina): </w:t>
-      </w:r>
-      <w:r>
-        <w:rPr>
-          <w:sz w:val="22"/>
-          <w:szCs w:val="22"/>
-        </w:rPr>
-        <w:t>SPINDLE.</w:t>
-      </w:r>
-    </w:p>
-    <w:p>
-      <w:pPr>
-        <w:spacing w:after="120"/>
-        <w:rPr>
-          <w:sz w:val="22"/>
-          <w:szCs w:val="22"/>
+          <w:u w:val="single"/>
         </w:rPr>
       </w:pPr>
       <w:r>
@@ -350,13 +277,69 @@
         </w:rPr>
         <w:t>Profundidade de corte (ap): PASSE</w:t>
       </w:r>
+    </w:p>
+    <w:p>
+      <w:pPr>
+        <w:spacing w:after="120"/>
+        <w:rPr>
+          <w:sz w:val="22"/>
+          <w:szCs w:val="22"/>
+        </w:rPr>
+      </w:pPr>
       <w:r>
         <w:rPr>
           <w:sz w:val="22"/>
           <w:szCs w:val="22"/>
         </w:rPr>
-        <w:t>.</w:t>
+        <w:t xml:space="preserve">- </w:t>
       </w:r>
+      <w:r>
+        <w:rPr>
+          <w:sz w:val="22"/>
+          <w:szCs w:val="22"/>
+        </w:rPr>
+        <w:t>RPM do spindle (</w:t>
+      </w:r>
+      <w:r>
+        <w:rPr>
+          <w:sz w:val="22"/>
+          <w:szCs w:val="22"/>
+        </w:rPr>
+        <w:t>n</w:t>
+      </w:r>
+      <w:r>
+        <w:rPr>
+          <w:sz w:val="22"/>
+          <w:szCs w:val="22"/>
+        </w:rPr>
+        <w:t xml:space="preserve">): </w:t>
+      </w:r>
+      <w:r>
+        <w:rPr>
+          <w:sz w:val="22"/>
+          <w:szCs w:val="22"/>
+        </w:rPr>
+        <w:t>SPINDLE</w:t>
+      </w:r>
+    </w:p>
+    <w:p>
+      <w:pPr>
+        <w:spacing w:after="120"/>
+        <w:rPr>
+          <w:sz w:val="22"/>
+          <w:szCs w:val="22"/>
+          <w:u w:val="single"/>
+        </w:rPr>
+      </w:pPr>
+      <w:r>
+        <w:rPr>
+          <w:sz w:val="22"/>
+          <w:szCs w:val="22"/>
+        </w:rPr>
+        <w:t>- Avanço (Fn): AVANÇO</w:t>
+      </w:r>
+      <w:bookmarkStart w:id="0" w:name="_GoBack"/>
+      <w:bookmarkEnd w:id="0"/>
     </w:p>
     <w:sectPr>
       <w:footerReference w:type="default" r:id="rId9"/>
@@ -479,7 +462,17 @@
         <w:sz w:val="18"/>
         <w:szCs w:val="18"/>
       </w:rPr>
-      <w:t>Copyright © 2025 Compilador G-Code. Todos os direitos reservados.</w:t>
+      <w:t xml:space="preserve">Copyright © </w:t>
+    </w:r>
+    <w:r>
+      <w:rPr>
+        <w:b/>
+        <w:bCs/>
+        <w:color w:val="2683C6" w:themeColor="accent2"/>
+        <w:sz w:val="18"/>
+        <w:szCs w:val="18"/>
+      </w:rPr>
+      <w:t>2025 Compilador G-Code. Todos os direitos reservados.</w:t>
     </w:r>
   </w:p>
 </w:ftr>
@@ -3861,7 +3854,7 @@
 </file>
 
 <file path=customXml/itemProps2.xml><?xml version="1.0" encoding="utf-8"?>
-<ds:datastoreItem xmlns:ds="http://schemas.openxmlformats.org/officeDocument/2006/customXml" ds:itemID="{B64091BF-9A31-4274-B3F3-D7BC7A6E0E1E}">
+<ds:datastoreItem xmlns:ds="http://schemas.openxmlformats.org/officeDocument/2006/customXml" ds:itemID="{BD788190-D6E6-4A43-9C80-D0DF04869FBB}">
   <ds:schemaRefs>
     <ds:schemaRef ds:uri="http://schemas.openxmlformats.org/officeDocument/2006/bibliography"/>
   </ds:schemaRefs>

</xml_diff>